<commit_message>
Re-add DOCX with binary handling
</commit_message>
<xml_diff>
--- a/books/cartwright-autobiography/input/original.docx
+++ b/books/cartwright-autobiography/input/original.docx
@@ -2,6 +2,14 @@
 <file path=word/document.xml><?xml version="1.0" encoding="utf-8"?>
 <w:document xmlns:wpc="http://schemas.microsoft.com/office/word/2010/wordprocessingCanvas" xmlns:cx="http://schemas.microsoft.com/office/drawing/2014/chartex" xmlns:cx1="http://schemas.microsoft.com/office/drawing/2015/9/8/chartex" xmlns:cx2="http://schemas.microsoft.com/office/drawing/2015/10/21/chartex" xmlns:cx3="http://schemas.microsoft.com/office/drawing/2016/5/9/chartex" xmlns:cx4="http://schemas.microsoft.com/office/drawing/2016/5/10/chartex" xmlns:cx5="http://schemas.microsoft.com/office/drawing/2016/5/11/chartex" xmlns:cx6="http://schemas.microsoft.com/office/drawing/2016/5/12/chartex" xmlns:cx7="http://schemas.microsoft.com/office/drawing/2016/5/13/chartex" xmlns:cx8="http://schemas.microsoft.com/office/drawing/2016/5/14/chartex" xmlns:mc="http://schemas.openxmlformats.org/markup-compatibility/2006" xmlns:aink="http://schemas.microsoft.com/office/drawing/2016/ink" xmlns:am3d="http://schemas.microsoft.com/office/drawing/2017/model3d" xmlns:o="urn:schemas-microsoft-com:office:office" xmlns:oel="http://schemas.microsoft.com/office/2019/extlst" xmlns:r="http://schemas.openxmlformats.org/officeDocument/2006/relationships" xmlns:m="http://schemas.openxmlformats.org/officeDocument/2006/math" xmlns:v="urn:schemas-microsoft-com:vml" xmlns:wp14="http://schemas.microsoft.com/office/word/2010/wordprocessingDrawing" xmlns:wp="http://schemas.openxmlformats.org/drawingml/2006/wordprocessingDrawing" xmlns:w10="urn:schemas-microsoft-com:office:word" xmlns:w="http://schemas.openxmlformats.org/wordprocessingml/2006/main" xmlns:w14="http://schemas.microsoft.com/office/word/2010/wordml" xmlns:w15="http://schemas.microsoft.com/office/word/2012/wordml" xmlns:w16cex="http://schemas.microsoft.com/office/word/2018/wordml/cex" xmlns:w16cid="http://schemas.microsoft.com/office/word/2016/wordml/cid" xmlns:w16="http://schemas.microsoft.com/office/word/2018/wordml" xmlns:w16du="http://schemas.microsoft.com/office/word/2023/wordml/word16du" xmlns:w16sdtdh="http://schemas.microsoft.com/office/word/2020/wordml/sdtdatahash" xmlns:w16sdtfl="http://schemas.microsoft.com/office/word/2024/wordml/sdtformatlock" xmlns:w16se="http://schemas.microsoft.com/office/word/2015/wordml/symex" xmlns:wpg="http://schemas.microsoft.com/office/word/2010/wordprocessingGroup" xmlns:wpi="http://schemas.microsoft.com/office/word/2010/wordprocessingInk" xmlns:wne="http://schemas.microsoft.com/office/word/2006/wordml" xmlns:wps="http://schemas.microsoft.com/office/word/2010/wordprocessingShape" mc:Ignorable="w14 w15 w16se w16cid w16 w16cex w16sdtdh w16sdtfl w16du wp14">
   <w:body>
+    <w:p>
+      <w:pPr>
+        <w:jc w:val="center"/>
+        <w:rPr>
+          <w:sz w:val="24"/>
+        </w:rPr>
+      </w:pPr>
+    </w:p>
     <w:p>
       <w:pPr>
         <w:jc w:val="center"/>
@@ -467,7 +475,7 @@
         </w:rPr>
         <w:t xml:space="preserve">Published in the United States of America </w:t>
       </w:r>
-      <w:hyperlink r:id="rId4" w:history="1">
+      <w:hyperlink r:id="rId6" w:history="1">
         <w:r>
           <w:rPr>
             <w:color w:val="0070C0"/>
@@ -532,28 +540,30 @@
           <w:sz w:val="22"/>
         </w:rPr>
         <w:drawing>
-          <wp:inline distT="0" distB="0" distL="0" distR="0" wp14:anchorId="50F63054" wp14:editId="0FA8F5F0">
+          <wp:inline distT="0" distB="0" distL="114300" distR="114300" wp14:anchorId="7FA45CCD" wp14:editId="5F893276">
             <wp:extent cx="4022725" cy="4343400"/>
-            <wp:effectExtent l="0" t="0" r="0" b="0"/>
-            <wp:docPr id="1603256138" name="Picture 1603256138"/>
-            <wp:cNvGraphicFramePr/>
+            <wp:effectExtent l="0" t="0" r="15875" b="0"/>
+            <wp:docPr id="2" name="Picture 2"/>
+            <wp:cNvGraphicFramePr>
+              <a:graphicFrameLocks xmlns:a="http://schemas.openxmlformats.org/drawingml/2006/main" noChangeAspect="1"/>
+            </wp:cNvGraphicFramePr>
             <a:graphic xmlns:a="http://schemas.openxmlformats.org/drawingml/2006/main">
               <a:graphicData uri="http://schemas.openxmlformats.org/drawingml/2006/picture">
                 <pic:pic xmlns:pic="http://schemas.openxmlformats.org/drawingml/2006/picture">
                   <pic:nvPicPr>
-                    <pic:cNvPr id="0" name=""/>
+                    <pic:cNvPr id="2" name="Picture 2"/>
                     <pic:cNvPicPr>
                       <a:picLocks noChangeAspect="1"/>
                     </pic:cNvPicPr>
                   </pic:nvPicPr>
                   <pic:blipFill>
-                    <a:blip r:embed="rId5"/>
+                    <a:blip r:embed="rId7"/>
                     <a:srcRect/>
                     <a:stretch>
                       <a:fillRect/>
                     </a:stretch>
                   </pic:blipFill>
-                  <pic:spPr bwMode="auto">
+                  <pic:spPr>
                     <a:xfrm>
                       <a:off x="0" y="0"/>
                       <a:ext cx="4022725" cy="4343400"/>
@@ -815,14 +825,12 @@
         <w:spacing w:line="276" w:lineRule="auto"/>
         <w:rPr>
           <w:rFonts w:ascii="Garamond" w:eastAsia="Garamond" w:hAnsi="Garamond"/>
-          <w:noProof/>
           <w:sz w:val="28"/>
         </w:rPr>
       </w:pPr>
       <w:r>
         <w:rPr>
           <w:rFonts w:ascii="Garamond" w:eastAsia="Garamond" w:hAnsi="Garamond"/>
-          <w:noProof/>
           <w:sz w:val="28"/>
         </w:rPr>
         <w:fldChar w:fldCharType="begin"/>
@@ -830,7 +838,6 @@
       <w:r>
         <w:rPr>
           <w:rFonts w:ascii="Garamond" w:eastAsia="Garamond" w:hAnsi="Garamond"/>
-          <w:noProof/>
           <w:sz w:val="28"/>
         </w:rPr>
         <w:instrText xml:space="preserve"> TOC \o "1-2" \n \p " " \h \z \u </w:instrText>
@@ -838,7 +845,6 @@
       <w:r>
         <w:rPr>
           <w:rFonts w:ascii="Garamond" w:eastAsia="Garamond" w:hAnsi="Garamond"/>
-          <w:noProof/>
           <w:sz w:val="28"/>
         </w:rPr>
         <w:fldChar w:fldCharType="separate"/>
@@ -847,7 +853,6 @@
         <w:r>
           <w:rPr>
             <w:rFonts w:ascii="Garamond" w:eastAsia="Garamond" w:hAnsi="Garamond"/>
-            <w:noProof/>
             <w:sz w:val="28"/>
           </w:rPr>
           <w:t>CHAPTER 1</w:t>
@@ -889,7 +894,6 @@
         <w:spacing w:line="276" w:lineRule="auto"/>
         <w:rPr>
           <w:rFonts w:ascii="Garamond" w:eastAsia="Garamond" w:hAnsi="Garamond"/>
-          <w:noProof/>
           <w:sz w:val="28"/>
         </w:rPr>
       </w:pPr>
@@ -897,7 +901,6 @@
         <w:r>
           <w:rPr>
             <w:rFonts w:ascii="Garamond" w:eastAsia="Garamond" w:hAnsi="Garamond"/>
-            <w:noProof/>
             <w:sz w:val="28"/>
           </w:rPr>
           <w:t>CHAPTER 2</w:t>
@@ -939,7 +942,6 @@
         <w:spacing w:line="276" w:lineRule="auto"/>
         <w:rPr>
           <w:rFonts w:ascii="Garamond" w:eastAsia="Garamond" w:hAnsi="Garamond"/>
-          <w:noProof/>
           <w:sz w:val="28"/>
         </w:rPr>
       </w:pPr>
@@ -947,7 +949,6 @@
         <w:r>
           <w:rPr>
             <w:rFonts w:ascii="Garamond" w:eastAsia="Garamond" w:hAnsi="Garamond"/>
-            <w:noProof/>
             <w:sz w:val="28"/>
           </w:rPr>
           <w:t>CHAPTER 3</w:t>
@@ -989,7 +990,6 @@
         <w:spacing w:line="276" w:lineRule="auto"/>
         <w:rPr>
           <w:rFonts w:ascii="Garamond" w:eastAsia="Garamond" w:hAnsi="Garamond"/>
-          <w:noProof/>
           <w:sz w:val="28"/>
         </w:rPr>
       </w:pPr>
@@ -997,7 +997,6 @@
         <w:r>
           <w:rPr>
             <w:rFonts w:ascii="Garamond" w:eastAsia="Garamond" w:hAnsi="Garamond"/>
-            <w:noProof/>
             <w:sz w:val="28"/>
           </w:rPr>
           <w:t>CHAPTER 4</w:t>
@@ -1039,7 +1038,6 @@
         <w:spacing w:line="276" w:lineRule="auto"/>
         <w:rPr>
           <w:rFonts w:ascii="Garamond" w:eastAsia="Garamond" w:hAnsi="Garamond"/>
-          <w:noProof/>
           <w:sz w:val="28"/>
         </w:rPr>
       </w:pPr>
@@ -1047,7 +1045,6 @@
         <w:r>
           <w:rPr>
             <w:rFonts w:ascii="Garamond" w:eastAsia="Garamond" w:hAnsi="Garamond"/>
-            <w:noProof/>
             <w:sz w:val="28"/>
           </w:rPr>
           <w:t>CHAPTER 5</w:t>
@@ -1089,7 +1086,6 @@
         <w:spacing w:line="276" w:lineRule="auto"/>
         <w:rPr>
           <w:rFonts w:ascii="Garamond" w:eastAsia="Garamond" w:hAnsi="Garamond"/>
-          <w:noProof/>
           <w:sz w:val="28"/>
         </w:rPr>
       </w:pPr>
@@ -1097,7 +1093,6 @@
         <w:r>
           <w:rPr>
             <w:rFonts w:ascii="Garamond" w:eastAsia="Garamond" w:hAnsi="Garamond"/>
-            <w:noProof/>
             <w:sz w:val="28"/>
           </w:rPr>
           <w:t>CHAPTER 6</w:t>
@@ -1139,7 +1134,6 @@
         <w:spacing w:line="276" w:lineRule="auto"/>
         <w:rPr>
           <w:rFonts w:ascii="Garamond" w:eastAsia="Garamond" w:hAnsi="Garamond"/>
-          <w:noProof/>
           <w:sz w:val="28"/>
         </w:rPr>
       </w:pPr>
@@ -1147,7 +1141,6 @@
         <w:r>
           <w:rPr>
             <w:rFonts w:ascii="Garamond" w:eastAsia="Garamond" w:hAnsi="Garamond"/>
-            <w:noProof/>
             <w:sz w:val="28"/>
           </w:rPr>
           <w:t>CHAPTER 7</w:t>
@@ -1189,7 +1182,6 @@
         <w:spacing w:line="276" w:lineRule="auto"/>
         <w:rPr>
           <w:rFonts w:ascii="Garamond" w:eastAsia="Garamond" w:hAnsi="Garamond"/>
-          <w:noProof/>
           <w:sz w:val="28"/>
         </w:rPr>
       </w:pPr>
@@ -1197,7 +1189,6 @@
         <w:r>
           <w:rPr>
             <w:rFonts w:ascii="Garamond" w:eastAsia="Garamond" w:hAnsi="Garamond"/>
-            <w:noProof/>
             <w:sz w:val="28"/>
           </w:rPr>
           <w:t>CHAPTER 8</w:t>
@@ -1239,7 +1230,6 @@
         <w:spacing w:line="276" w:lineRule="auto"/>
         <w:rPr>
           <w:rFonts w:ascii="Garamond" w:eastAsia="Garamond" w:hAnsi="Garamond"/>
-          <w:noProof/>
           <w:sz w:val="28"/>
         </w:rPr>
       </w:pPr>
@@ -1247,7 +1237,6 @@
         <w:r>
           <w:rPr>
             <w:rFonts w:ascii="Garamond" w:eastAsia="Garamond" w:hAnsi="Garamond"/>
-            <w:noProof/>
             <w:sz w:val="28"/>
           </w:rPr>
           <w:t>CHAPTER 9</w:t>
@@ -1289,7 +1278,6 @@
         <w:spacing w:line="276" w:lineRule="auto"/>
         <w:rPr>
           <w:rFonts w:ascii="Garamond" w:eastAsia="Garamond" w:hAnsi="Garamond"/>
-          <w:noProof/>
           <w:sz w:val="28"/>
         </w:rPr>
       </w:pPr>
@@ -1297,7 +1285,6 @@
         <w:r>
           <w:rPr>
             <w:rFonts w:ascii="Garamond" w:eastAsia="Garamond" w:hAnsi="Garamond"/>
-            <w:noProof/>
             <w:sz w:val="28"/>
           </w:rPr>
           <w:t>CHAPTER 10</w:t>
@@ -1339,7 +1326,6 @@
         <w:spacing w:line="276" w:lineRule="auto"/>
         <w:rPr>
           <w:rFonts w:ascii="Garamond" w:eastAsia="Garamond" w:hAnsi="Garamond"/>
-          <w:noProof/>
           <w:sz w:val="28"/>
         </w:rPr>
       </w:pPr>
@@ -1347,7 +1333,6 @@
         <w:r>
           <w:rPr>
             <w:rFonts w:ascii="Garamond" w:eastAsia="Garamond" w:hAnsi="Garamond"/>
-            <w:noProof/>
             <w:sz w:val="28"/>
           </w:rPr>
           <w:t>CHAPTER 11</w:t>
@@ -1404,7 +1389,6 @@
         <w:spacing w:line="276" w:lineRule="auto"/>
         <w:rPr>
           <w:rFonts w:ascii="Garamond" w:eastAsia="Garamond" w:hAnsi="Garamond"/>
-          <w:noProof/>
           <w:sz w:val="28"/>
         </w:rPr>
       </w:pPr>
@@ -1412,7 +1396,6 @@
         <w:r>
           <w:rPr>
             <w:rFonts w:ascii="Garamond" w:eastAsia="Garamond" w:hAnsi="Garamond"/>
-            <w:noProof/>
             <w:sz w:val="28"/>
           </w:rPr>
           <w:t>CHAPTER 12</w:t>
@@ -1454,7 +1437,6 @@
         <w:spacing w:line="276" w:lineRule="auto"/>
         <w:rPr>
           <w:rFonts w:ascii="Garamond" w:eastAsia="Garamond" w:hAnsi="Garamond"/>
-          <w:noProof/>
           <w:sz w:val="28"/>
         </w:rPr>
       </w:pPr>
@@ -1462,7 +1444,6 @@
         <w:r>
           <w:rPr>
             <w:rFonts w:ascii="Garamond" w:eastAsia="Garamond" w:hAnsi="Garamond"/>
-            <w:noProof/>
             <w:sz w:val="28"/>
           </w:rPr>
           <w:t>CHAPTER 13</w:t>
@@ -1504,7 +1485,6 @@
         <w:spacing w:line="276" w:lineRule="auto"/>
         <w:rPr>
           <w:rFonts w:ascii="Garamond" w:eastAsia="Garamond" w:hAnsi="Garamond"/>
-          <w:noProof/>
           <w:sz w:val="28"/>
         </w:rPr>
       </w:pPr>
@@ -1512,7 +1492,6 @@
         <w:r>
           <w:rPr>
             <w:rFonts w:ascii="Garamond" w:eastAsia="Garamond" w:hAnsi="Garamond"/>
-            <w:noProof/>
             <w:sz w:val="28"/>
           </w:rPr>
           <w:t>CHAPTER 14</w:t>
@@ -1554,7 +1533,6 @@
         <w:spacing w:line="276" w:lineRule="auto"/>
         <w:rPr>
           <w:rFonts w:ascii="Garamond" w:eastAsia="Garamond" w:hAnsi="Garamond"/>
-          <w:noProof/>
           <w:sz w:val="28"/>
         </w:rPr>
       </w:pPr>
@@ -1562,7 +1540,6 @@
         <w:r>
           <w:rPr>
             <w:rFonts w:ascii="Garamond" w:eastAsia="Garamond" w:hAnsi="Garamond"/>
-            <w:noProof/>
             <w:sz w:val="28"/>
           </w:rPr>
           <w:t>CHAPTER 15</w:t>
@@ -1604,7 +1581,6 @@
         <w:spacing w:line="276" w:lineRule="auto"/>
         <w:rPr>
           <w:rFonts w:ascii="Garamond" w:eastAsia="Garamond" w:hAnsi="Garamond"/>
-          <w:noProof/>
           <w:sz w:val="28"/>
         </w:rPr>
       </w:pPr>
@@ -1612,7 +1588,6 @@
         <w:r>
           <w:rPr>
             <w:rFonts w:ascii="Garamond" w:eastAsia="Garamond" w:hAnsi="Garamond"/>
-            <w:noProof/>
             <w:sz w:val="28"/>
           </w:rPr>
           <w:t>CHAPTER 16</w:t>
@@ -1654,7 +1629,6 @@
         <w:spacing w:line="276" w:lineRule="auto"/>
         <w:rPr>
           <w:rFonts w:ascii="Garamond" w:eastAsia="Garamond" w:hAnsi="Garamond"/>
-          <w:noProof/>
           <w:sz w:val="28"/>
         </w:rPr>
       </w:pPr>
@@ -1662,7 +1636,6 @@
         <w:r>
           <w:rPr>
             <w:rFonts w:ascii="Garamond" w:eastAsia="Garamond" w:hAnsi="Garamond"/>
-            <w:noProof/>
             <w:sz w:val="28"/>
           </w:rPr>
           <w:t>CHAPTER 17</w:t>
@@ -1704,7 +1677,6 @@
         <w:spacing w:line="276" w:lineRule="auto"/>
         <w:rPr>
           <w:rFonts w:ascii="Garamond" w:eastAsia="Garamond" w:hAnsi="Garamond"/>
-          <w:noProof/>
           <w:sz w:val="28"/>
         </w:rPr>
       </w:pPr>
@@ -1712,7 +1684,6 @@
         <w:r>
           <w:rPr>
             <w:rFonts w:ascii="Garamond" w:eastAsia="Garamond" w:hAnsi="Garamond"/>
-            <w:noProof/>
             <w:sz w:val="28"/>
           </w:rPr>
           <w:t>CHAPTER 18</w:t>
@@ -1754,7 +1725,6 @@
         <w:spacing w:line="276" w:lineRule="auto"/>
         <w:rPr>
           <w:rFonts w:ascii="Garamond" w:eastAsia="Garamond" w:hAnsi="Garamond"/>
-          <w:noProof/>
           <w:sz w:val="28"/>
         </w:rPr>
       </w:pPr>
@@ -1762,7 +1732,6 @@
         <w:r>
           <w:rPr>
             <w:rFonts w:ascii="Garamond" w:eastAsia="Garamond" w:hAnsi="Garamond"/>
-            <w:noProof/>
             <w:sz w:val="28"/>
           </w:rPr>
           <w:t>CHAPTER 19</w:t>
@@ -1804,7 +1773,6 @@
         <w:spacing w:line="276" w:lineRule="auto"/>
         <w:rPr>
           <w:rFonts w:ascii="Garamond" w:eastAsia="Garamond" w:hAnsi="Garamond"/>
-          <w:noProof/>
           <w:sz w:val="28"/>
         </w:rPr>
       </w:pPr>
@@ -1812,7 +1780,6 @@
         <w:r>
           <w:rPr>
             <w:rFonts w:ascii="Garamond" w:eastAsia="Garamond" w:hAnsi="Garamond"/>
-            <w:noProof/>
             <w:sz w:val="28"/>
           </w:rPr>
           <w:t>CHAPTER 20</w:t>
@@ -1854,7 +1821,6 @@
         <w:spacing w:line="276" w:lineRule="auto"/>
         <w:rPr>
           <w:rFonts w:ascii="Garamond" w:eastAsia="Garamond" w:hAnsi="Garamond"/>
-          <w:noProof/>
           <w:sz w:val="28"/>
         </w:rPr>
       </w:pPr>
@@ -1862,7 +1828,6 @@
         <w:r>
           <w:rPr>
             <w:rFonts w:ascii="Garamond" w:eastAsia="Garamond" w:hAnsi="Garamond"/>
-            <w:noProof/>
             <w:sz w:val="28"/>
           </w:rPr>
           <w:t>CHAPTER 21</w:t>
@@ -1904,7 +1869,6 @@
         <w:spacing w:line="276" w:lineRule="auto"/>
         <w:rPr>
           <w:rFonts w:ascii="Garamond" w:eastAsia="Garamond" w:hAnsi="Garamond"/>
-          <w:noProof/>
           <w:sz w:val="28"/>
         </w:rPr>
       </w:pPr>
@@ -1912,7 +1876,6 @@
         <w:r>
           <w:rPr>
             <w:rFonts w:ascii="Garamond" w:eastAsia="Garamond" w:hAnsi="Garamond"/>
-            <w:noProof/>
             <w:sz w:val="28"/>
           </w:rPr>
           <w:t>CHAPTER 22</w:t>
@@ -1954,7 +1917,6 @@
         <w:spacing w:line="276" w:lineRule="auto"/>
         <w:rPr>
           <w:rFonts w:ascii="Garamond" w:eastAsia="Garamond" w:hAnsi="Garamond"/>
-          <w:noProof/>
           <w:sz w:val="28"/>
         </w:rPr>
       </w:pPr>
@@ -1962,7 +1924,6 @@
         <w:r>
           <w:rPr>
             <w:rFonts w:ascii="Garamond" w:eastAsia="Garamond" w:hAnsi="Garamond"/>
-            <w:noProof/>
             <w:sz w:val="28"/>
           </w:rPr>
           <w:t>CHAPTER 23</w:t>
@@ -2004,7 +1965,6 @@
         <w:spacing w:line="276" w:lineRule="auto"/>
         <w:rPr>
           <w:rFonts w:ascii="Garamond" w:eastAsia="Garamond" w:hAnsi="Garamond"/>
-          <w:noProof/>
           <w:sz w:val="28"/>
         </w:rPr>
       </w:pPr>
@@ -2012,7 +1972,6 @@
         <w:r>
           <w:rPr>
             <w:rFonts w:ascii="Garamond" w:eastAsia="Garamond" w:hAnsi="Garamond"/>
-            <w:noProof/>
             <w:sz w:val="28"/>
           </w:rPr>
           <w:t>CHAPTER 24</w:t>
@@ -2054,7 +2013,6 @@
         <w:spacing w:line="276" w:lineRule="auto"/>
         <w:rPr>
           <w:rFonts w:ascii="Garamond" w:eastAsia="Garamond" w:hAnsi="Garamond"/>
-          <w:noProof/>
           <w:sz w:val="28"/>
         </w:rPr>
       </w:pPr>
@@ -2062,7 +2020,6 @@
         <w:r>
           <w:rPr>
             <w:rFonts w:ascii="Garamond" w:eastAsia="Garamond" w:hAnsi="Garamond"/>
-            <w:noProof/>
             <w:sz w:val="28"/>
           </w:rPr>
           <w:t>CHAPTER 25</w:t>
@@ -2104,7 +2061,6 @@
         <w:spacing w:line="276" w:lineRule="auto"/>
         <w:rPr>
           <w:rFonts w:ascii="Garamond" w:eastAsia="Garamond" w:hAnsi="Garamond"/>
-          <w:noProof/>
           <w:sz w:val="28"/>
         </w:rPr>
       </w:pPr>
@@ -2112,7 +2068,6 @@
         <w:r>
           <w:rPr>
             <w:rFonts w:ascii="Garamond" w:eastAsia="Garamond" w:hAnsi="Garamond"/>
-            <w:noProof/>
             <w:sz w:val="28"/>
           </w:rPr>
           <w:t>CHAPTER 26</w:t>
@@ -2154,7 +2109,6 @@
         <w:spacing w:line="276" w:lineRule="auto"/>
         <w:rPr>
           <w:rFonts w:ascii="Garamond" w:eastAsia="Garamond" w:hAnsi="Garamond"/>
-          <w:noProof/>
           <w:sz w:val="28"/>
         </w:rPr>
       </w:pPr>
@@ -2162,7 +2116,6 @@
         <w:r>
           <w:rPr>
             <w:rFonts w:ascii="Garamond" w:eastAsia="Garamond" w:hAnsi="Garamond"/>
-            <w:noProof/>
             <w:sz w:val="28"/>
           </w:rPr>
           <w:t>CHAPTER 27</w:t>
@@ -2204,7 +2157,6 @@
         <w:spacing w:line="276" w:lineRule="auto"/>
         <w:rPr>
           <w:rFonts w:ascii="Garamond" w:eastAsia="Garamond" w:hAnsi="Garamond"/>
-          <w:noProof/>
           <w:sz w:val="28"/>
         </w:rPr>
       </w:pPr>
@@ -2212,7 +2164,6 @@
         <w:r>
           <w:rPr>
             <w:rFonts w:ascii="Garamond" w:eastAsia="Garamond" w:hAnsi="Garamond"/>
-            <w:noProof/>
             <w:sz w:val="28"/>
           </w:rPr>
           <w:t>CHAPTER 28</w:t>
@@ -2254,7 +2205,6 @@
         <w:spacing w:line="276" w:lineRule="auto"/>
         <w:rPr>
           <w:rFonts w:ascii="Garamond" w:eastAsia="Garamond" w:hAnsi="Garamond"/>
-          <w:noProof/>
           <w:sz w:val="28"/>
         </w:rPr>
       </w:pPr>
@@ -2262,7 +2212,6 @@
         <w:r>
           <w:rPr>
             <w:rFonts w:ascii="Garamond" w:eastAsia="Garamond" w:hAnsi="Garamond"/>
-            <w:noProof/>
             <w:sz w:val="28"/>
           </w:rPr>
           <w:t>CHAPTER 29</w:t>
@@ -2304,7 +2253,6 @@
         <w:spacing w:line="276" w:lineRule="auto"/>
         <w:rPr>
           <w:rFonts w:ascii="Garamond" w:eastAsia="Garamond" w:hAnsi="Garamond"/>
-          <w:noProof/>
           <w:sz w:val="28"/>
         </w:rPr>
       </w:pPr>
@@ -2312,7 +2260,6 @@
         <w:r>
           <w:rPr>
             <w:rFonts w:ascii="Garamond" w:eastAsia="Garamond" w:hAnsi="Garamond"/>
-            <w:noProof/>
             <w:sz w:val="28"/>
           </w:rPr>
           <w:t>CHAPTER 30</w:t>
@@ -2354,7 +2301,6 @@
         <w:spacing w:line="276" w:lineRule="auto"/>
         <w:rPr>
           <w:rFonts w:ascii="Garamond" w:eastAsia="Garamond" w:hAnsi="Garamond"/>
-          <w:noProof/>
           <w:sz w:val="28"/>
         </w:rPr>
       </w:pPr>
@@ -2362,7 +2308,6 @@
         <w:r>
           <w:rPr>
             <w:rFonts w:ascii="Garamond" w:eastAsia="Garamond" w:hAnsi="Garamond"/>
-            <w:noProof/>
             <w:sz w:val="28"/>
           </w:rPr>
           <w:t>CHAPTER 31</w:t>
@@ -2404,7 +2349,6 @@
         <w:spacing w:line="276" w:lineRule="auto"/>
         <w:rPr>
           <w:rFonts w:ascii="Garamond" w:eastAsia="Garamond" w:hAnsi="Garamond"/>
-          <w:noProof/>
           <w:sz w:val="28"/>
         </w:rPr>
       </w:pPr>
@@ -2412,7 +2356,6 @@
         <w:r>
           <w:rPr>
             <w:rFonts w:ascii="Garamond" w:eastAsia="Garamond" w:hAnsi="Garamond"/>
-            <w:noProof/>
             <w:sz w:val="28"/>
           </w:rPr>
           <w:t>CHAPTER 32</w:t>
@@ -2454,7 +2397,6 @@
         <w:spacing w:line="276" w:lineRule="auto"/>
         <w:rPr>
           <w:rFonts w:ascii="Garamond" w:eastAsia="Garamond" w:hAnsi="Garamond"/>
-          <w:noProof/>
           <w:sz w:val="28"/>
         </w:rPr>
       </w:pPr>
@@ -2462,7 +2404,6 @@
         <w:r>
           <w:rPr>
             <w:rFonts w:ascii="Garamond" w:eastAsia="Garamond" w:hAnsi="Garamond"/>
-            <w:noProof/>
             <w:sz w:val="28"/>
           </w:rPr>
           <w:t>CHAPTER 33</w:t>
@@ -2504,7 +2445,6 @@
         <w:spacing w:line="276" w:lineRule="auto"/>
         <w:rPr>
           <w:rFonts w:ascii="Garamond" w:eastAsia="Garamond" w:hAnsi="Garamond"/>
-          <w:noProof/>
           <w:sz w:val="28"/>
         </w:rPr>
       </w:pPr>
@@ -2512,7 +2452,6 @@
         <w:r>
           <w:rPr>
             <w:rFonts w:ascii="Garamond" w:eastAsia="Garamond" w:hAnsi="Garamond"/>
-            <w:noProof/>
             <w:sz w:val="28"/>
           </w:rPr>
           <w:t>CHAPTER 34</w:t>
@@ -16219,28 +16158,30 @@
           <w:noProof/>
         </w:rPr>
         <w:drawing>
-          <wp:inline distT="0" distB="0" distL="0" distR="0" wp14:anchorId="5FEFAF7C" wp14:editId="092C03D6">
+          <wp:inline distT="0" distB="0" distL="114300" distR="114300" wp14:anchorId="2D61C930" wp14:editId="1B6FF4A1">
             <wp:extent cx="4107180" cy="4777740"/>
-            <wp:effectExtent l="0" t="0" r="0" b="0"/>
-            <wp:docPr id="985631932" name="Picture 985631932"/>
-            <wp:cNvGraphicFramePr/>
+            <wp:effectExtent l="0" t="0" r="7620" b="3810"/>
+            <wp:docPr id="3" name="Picture 3"/>
+            <wp:cNvGraphicFramePr>
+              <a:graphicFrameLocks xmlns:a="http://schemas.openxmlformats.org/drawingml/2006/main" noChangeAspect="1"/>
+            </wp:cNvGraphicFramePr>
             <a:graphic xmlns:a="http://schemas.openxmlformats.org/drawingml/2006/main">
               <a:graphicData uri="http://schemas.openxmlformats.org/drawingml/2006/picture">
                 <pic:pic xmlns:pic="http://schemas.openxmlformats.org/drawingml/2006/picture">
                   <pic:nvPicPr>
-                    <pic:cNvPr id="0" name=""/>
+                    <pic:cNvPr id="3" name="Picture 3"/>
                     <pic:cNvPicPr>
                       <a:picLocks noChangeAspect="1"/>
                     </pic:cNvPicPr>
                   </pic:nvPicPr>
                   <pic:blipFill>
-                    <a:blip r:embed="rId6"/>
+                    <a:blip r:embed="rId8"/>
                     <a:srcRect/>
                     <a:stretch>
                       <a:fillRect/>
                     </a:stretch>
                   </pic:blipFill>
-                  <pic:spPr bwMode="auto">
+                  <pic:spPr>
                     <a:xfrm>
                       <a:off x="0" y="0"/>
                       <a:ext cx="4107180" cy="4777740"/>
@@ -16357,7 +16298,7 @@
           <w:sz w:val="22"/>
         </w:rPr>
       </w:pPr>
-      <w:hyperlink r:id="rId7" w:history="1">
+      <w:hyperlink r:id="rId9" w:history="1">
         <w:r>
           <w:rPr>
             <w:color w:val="0070C0"/>
@@ -16377,178 +16318,164 @@
 </w:document>
 </file>
 
+<file path=word/endnotes.xml><?xml version="1.0" encoding="utf-8"?>
+<w:endnotes xmlns:wpc="http://schemas.microsoft.com/office/word/2010/wordprocessingCanvas" xmlns:cx="http://schemas.microsoft.com/office/drawing/2014/chartex" xmlns:cx1="http://schemas.microsoft.com/office/drawing/2015/9/8/chartex" xmlns:cx2="http://schemas.microsoft.com/office/drawing/2015/10/21/chartex" xmlns:cx3="http://schemas.microsoft.com/office/drawing/2016/5/9/chartex" xmlns:cx4="http://schemas.microsoft.com/office/drawing/2016/5/10/chartex" xmlns:cx5="http://schemas.microsoft.com/office/drawing/2016/5/11/chartex" xmlns:cx6="http://schemas.microsoft.com/office/drawing/2016/5/12/chartex" xmlns:cx7="http://schemas.microsoft.com/office/drawing/2016/5/13/chartex" xmlns:cx8="http://schemas.microsoft.com/office/drawing/2016/5/14/chartex" xmlns:mc="http://schemas.openxmlformats.org/markup-compatibility/2006" xmlns:aink="http://schemas.microsoft.com/office/drawing/2016/ink" xmlns:am3d="http://schemas.microsoft.com/office/drawing/2017/model3d" xmlns:o="urn:schemas-microsoft-com:office:office" xmlns:oel="http://schemas.microsoft.com/office/2019/extlst" xmlns:r="http://schemas.openxmlformats.org/officeDocument/2006/relationships" xmlns:m="http://schemas.openxmlformats.org/officeDocument/2006/math" xmlns:v="urn:schemas-microsoft-com:vml" xmlns:wp14="http://schemas.microsoft.com/office/word/2010/wordprocessingDrawing" xmlns:wp="http://schemas.openxmlformats.org/drawingml/2006/wordprocessingDrawing" xmlns:w10="urn:schemas-microsoft-com:office:word" xmlns:w="http://schemas.openxmlformats.org/wordprocessingml/2006/main" xmlns:w14="http://schemas.microsoft.com/office/word/2010/wordml" xmlns:w15="http://schemas.microsoft.com/office/word/2012/wordml" xmlns:w16cex="http://schemas.microsoft.com/office/word/2018/wordml/cex" xmlns:w16cid="http://schemas.microsoft.com/office/word/2016/wordml/cid" xmlns:w16="http://schemas.microsoft.com/office/word/2018/wordml" xmlns:w16du="http://schemas.microsoft.com/office/word/2023/wordml/word16du" xmlns:w16sdtdh="http://schemas.microsoft.com/office/word/2020/wordml/sdtdatahash" xmlns:w16sdtfl="http://schemas.microsoft.com/office/word/2024/wordml/sdtformatlock" xmlns:w16se="http://schemas.microsoft.com/office/word/2015/wordml/symex" xmlns:wpg="http://schemas.microsoft.com/office/word/2010/wordprocessingGroup" xmlns:wpi="http://schemas.microsoft.com/office/word/2010/wordprocessingInk" xmlns:wne="http://schemas.microsoft.com/office/word/2006/wordml" xmlns:wps="http://schemas.microsoft.com/office/word/2010/wordprocessingShape" mc:Ignorable="w14 w15 w16se w16cid w16 w16cex w16sdtdh w16sdtfl w16du wp14">
+  <w:endnote w:type="separator" w:id="-1">
+    <w:p>
+      <w:r>
+        <w:separator/>
+      </w:r>
+    </w:p>
+  </w:endnote>
+  <w:endnote w:type="continuationSeparator" w:id="0">
+    <w:p>
+      <w:r>
+        <w:continuationSeparator/>
+      </w:r>
+    </w:p>
+  </w:endnote>
+</w:endnotes>
+</file>
+
+<file path=word/footnotes.xml><?xml version="1.0" encoding="utf-8"?>
+<w:footnotes xmlns:wpc="http://schemas.microsoft.com/office/word/2010/wordprocessingCanvas" xmlns:cx="http://schemas.microsoft.com/office/drawing/2014/chartex" xmlns:cx1="http://schemas.microsoft.com/office/drawing/2015/9/8/chartex" xmlns:cx2="http://schemas.microsoft.com/office/drawing/2015/10/21/chartex" xmlns:cx3="http://schemas.microsoft.com/office/drawing/2016/5/9/chartex" xmlns:cx4="http://schemas.microsoft.com/office/drawing/2016/5/10/chartex" xmlns:cx5="http://schemas.microsoft.com/office/drawing/2016/5/11/chartex" xmlns:cx6="http://schemas.microsoft.com/office/drawing/2016/5/12/chartex" xmlns:cx7="http://schemas.microsoft.com/office/drawing/2016/5/13/chartex" xmlns:cx8="http://schemas.microsoft.com/office/drawing/2016/5/14/chartex" xmlns:mc="http://schemas.openxmlformats.org/markup-compatibility/2006" xmlns:aink="http://schemas.microsoft.com/office/drawing/2016/ink" xmlns:am3d="http://schemas.microsoft.com/office/drawing/2017/model3d" xmlns:o="urn:schemas-microsoft-com:office:office" xmlns:oel="http://schemas.microsoft.com/office/2019/extlst" xmlns:r="http://schemas.openxmlformats.org/officeDocument/2006/relationships" xmlns:m="http://schemas.openxmlformats.org/officeDocument/2006/math" xmlns:v="urn:schemas-microsoft-com:vml" xmlns:wp14="http://schemas.microsoft.com/office/word/2010/wordprocessingDrawing" xmlns:wp="http://schemas.openxmlformats.org/drawingml/2006/wordprocessingDrawing" xmlns:w10="urn:schemas-microsoft-com:office:word" xmlns:w="http://schemas.openxmlformats.org/wordprocessingml/2006/main" xmlns:w14="http://schemas.microsoft.com/office/word/2010/wordml" xmlns:w15="http://schemas.microsoft.com/office/word/2012/wordml" xmlns:w16cex="http://schemas.microsoft.com/office/word/2018/wordml/cex" xmlns:w16cid="http://schemas.microsoft.com/office/word/2016/wordml/cid" xmlns:w16="http://schemas.microsoft.com/office/word/2018/wordml" xmlns:w16du="http://schemas.microsoft.com/office/word/2023/wordml/word16du" xmlns:w16sdtdh="http://schemas.microsoft.com/office/word/2020/wordml/sdtdatahash" xmlns:w16sdtfl="http://schemas.microsoft.com/office/word/2024/wordml/sdtformatlock" xmlns:w16se="http://schemas.microsoft.com/office/word/2015/wordml/symex" xmlns:wpg="http://schemas.microsoft.com/office/word/2010/wordprocessingGroup" xmlns:wpi="http://schemas.microsoft.com/office/word/2010/wordprocessingInk" xmlns:wne="http://schemas.microsoft.com/office/word/2006/wordml" xmlns:wps="http://schemas.microsoft.com/office/word/2010/wordprocessingShape" mc:Ignorable="w14 w15 w16se w16cid w16 w16cex w16sdtdh w16sdtfl w16du wp14">
+  <w:footnote w:type="separator" w:id="-1">
+    <w:p>
+      <w:r>
+        <w:separator/>
+      </w:r>
+    </w:p>
+  </w:footnote>
+  <w:footnote w:type="continuationSeparator" w:id="0">
+    <w:p>
+      <w:r>
+        <w:continuationSeparator/>
+      </w:r>
+    </w:p>
+  </w:footnote>
+</w:footnotes>
+</file>
+
 <file path=word/styles.xml><?xml version="1.0" encoding="utf-8"?>
 <w:styles xmlns:mc="http://schemas.openxmlformats.org/markup-compatibility/2006" xmlns:r="http://schemas.openxmlformats.org/officeDocument/2006/relationships" xmlns:w="http://schemas.openxmlformats.org/wordprocessingml/2006/main" xmlns:w14="http://schemas.microsoft.com/office/word/2010/wordml" xmlns:w15="http://schemas.microsoft.com/office/word/2012/wordml" xmlns:w16cex="http://schemas.microsoft.com/office/word/2018/wordml/cex" xmlns:w16cid="http://schemas.microsoft.com/office/word/2016/wordml/cid" xmlns:w16="http://schemas.microsoft.com/office/word/2018/wordml" xmlns:w16du="http://schemas.microsoft.com/office/word/2023/wordml/word16du" xmlns:w16sdtdh="http://schemas.microsoft.com/office/word/2020/wordml/sdtdatahash" xmlns:w16sdtfl="http://schemas.microsoft.com/office/word/2024/wordml/sdtformatlock" xmlns:w16se="http://schemas.microsoft.com/office/word/2015/wordml/symex" mc:Ignorable="w14 w15 w16se w16cid w16 w16cex w16sdtdh w16sdtfl w16du">
   <w:docDefaults>
     <w:rPrDefault>
       <w:rPr>
-        <w:rFonts w:ascii="Times New Roman" w:eastAsia="Times New Roman" w:hAnsi="Times New Roman" w:cs="Times New Roman"/>
+        <w:rFonts w:ascii="Times New Roman" w:eastAsia="Times New Roman" w:hAnsi="Times New Roman" w:cstheme="minorBidi"/>
         <w:lang w:val="en-US" w:eastAsia="zh-CN" w:bidi="ar-SA"/>
       </w:rPr>
     </w:rPrDefault>
     <w:pPrDefault/>
   </w:docDefaults>
-  <w:latentStyles w:defLockedState="0" w:defUIPriority="99" w:defSemiHidden="0" w:defUnhideWhenUsed="0" w:defQFormat="0" w:count="376">
-    <w:lsdException w:name="Normal" w:uiPriority="0" w:qFormat="1"/>
-    <w:lsdException w:name="heading 1" w:uiPriority="9" w:qFormat="1"/>
-    <w:lsdException w:name="heading 2" w:semiHidden="1" w:uiPriority="9" w:unhideWhenUsed="1" w:qFormat="1"/>
-    <w:lsdException w:name="heading 3" w:semiHidden="1" w:uiPriority="9" w:unhideWhenUsed="1" w:qFormat="1"/>
-    <w:lsdException w:name="heading 4" w:semiHidden="1" w:uiPriority="9" w:unhideWhenUsed="1" w:qFormat="1"/>
-    <w:lsdException w:name="heading 5" w:semiHidden="1" w:uiPriority="9" w:unhideWhenUsed="1" w:qFormat="1"/>
-    <w:lsdException w:name="heading 6" w:semiHidden="1" w:uiPriority="9" w:unhideWhenUsed="1" w:qFormat="1"/>
-    <w:lsdException w:name="heading 7" w:semiHidden="1" w:uiPriority="9" w:unhideWhenUsed="1" w:qFormat="1"/>
-    <w:lsdException w:name="heading 8" w:semiHidden="1" w:uiPriority="9" w:unhideWhenUsed="1" w:qFormat="1"/>
-    <w:lsdException w:name="heading 9" w:semiHidden="1" w:uiPriority="9" w:unhideWhenUsed="1" w:qFormat="1"/>
-    <w:lsdException w:name="index 1" w:semiHidden="1" w:unhideWhenUsed="1"/>
-    <w:lsdException w:name="index 2" w:semiHidden="1" w:unhideWhenUsed="1"/>
-    <w:lsdException w:name="index 3" w:semiHidden="1" w:unhideWhenUsed="1"/>
-    <w:lsdException w:name="index 4" w:semiHidden="1" w:unhideWhenUsed="1"/>
-    <w:lsdException w:name="index 5" w:semiHidden="1" w:unhideWhenUsed="1"/>
-    <w:lsdException w:name="index 6" w:semiHidden="1" w:unhideWhenUsed="1"/>
-    <w:lsdException w:name="index 7" w:semiHidden="1" w:unhideWhenUsed="1"/>
-    <w:lsdException w:name="index 8" w:semiHidden="1" w:unhideWhenUsed="1"/>
-    <w:lsdException w:name="index 9" w:semiHidden="1" w:unhideWhenUsed="1"/>
-    <w:lsdException w:name="toc 1" w:semiHidden="1" w:uiPriority="39" w:unhideWhenUsed="1"/>
-    <w:lsdException w:name="toc 2" w:semiHidden="1" w:uiPriority="39" w:unhideWhenUsed="1"/>
-    <w:lsdException w:name="toc 3" w:semiHidden="1" w:uiPriority="39" w:unhideWhenUsed="1"/>
-    <w:lsdException w:name="toc 4" w:semiHidden="1" w:uiPriority="39" w:unhideWhenUsed="1"/>
-    <w:lsdException w:name="toc 5" w:semiHidden="1" w:uiPriority="39" w:unhideWhenUsed="1"/>
-    <w:lsdException w:name="toc 6" w:semiHidden="1" w:uiPriority="39" w:unhideWhenUsed="1"/>
-    <w:lsdException w:name="toc 7" w:semiHidden="1" w:uiPriority="39" w:unhideWhenUsed="1"/>
-    <w:lsdException w:name="toc 8" w:semiHidden="1" w:uiPriority="39" w:unhideWhenUsed="1"/>
-    <w:lsdException w:name="toc 9" w:semiHidden="1" w:uiPriority="39" w:unhideWhenUsed="1"/>
-    <w:lsdException w:name="Normal Indent" w:semiHidden="1" w:unhideWhenUsed="1"/>
-    <w:lsdException w:name="footnote text" w:semiHidden="1" w:unhideWhenUsed="1"/>
-    <w:lsdException w:name="annotation text" w:semiHidden="1" w:unhideWhenUsed="1"/>
-    <w:lsdException w:name="header" w:semiHidden="1" w:unhideWhenUsed="1"/>
-    <w:lsdException w:name="footer" w:semiHidden="1" w:unhideWhenUsed="1"/>
-    <w:lsdException w:name="index heading" w:semiHidden="1" w:unhideWhenUsed="1"/>
-    <w:lsdException w:name="caption" w:semiHidden="1" w:uiPriority="35" w:unhideWhenUsed="1" w:qFormat="1"/>
-    <w:lsdException w:name="table of figures" w:semiHidden="1" w:unhideWhenUsed="1"/>
-    <w:lsdException w:name="envelope address" w:semiHidden="1" w:unhideWhenUsed="1"/>
-    <w:lsdException w:name="envelope return" w:semiHidden="1" w:unhideWhenUsed="1"/>
-    <w:lsdException w:name="footnote reference" w:semiHidden="1" w:unhideWhenUsed="1"/>
-    <w:lsdException w:name="annotation reference" w:semiHidden="1" w:unhideWhenUsed="1"/>
-    <w:lsdException w:name="line number" w:semiHidden="1" w:unhideWhenUsed="1"/>
-    <w:lsdException w:name="page number" w:semiHidden="1" w:unhideWhenUsed="1"/>
-    <w:lsdException w:name="endnote reference" w:semiHidden="1" w:unhideWhenUsed="1"/>
-    <w:lsdException w:name="endnote text" w:semiHidden="1" w:unhideWhenUsed="1"/>
-    <w:lsdException w:name="table of authorities" w:semiHidden="1" w:unhideWhenUsed="1"/>
-    <w:lsdException w:name="macro" w:semiHidden="1" w:unhideWhenUsed="1"/>
-    <w:lsdException w:name="toa heading" w:semiHidden="1" w:unhideWhenUsed="1"/>
-    <w:lsdException w:name="List" w:semiHidden="1" w:unhideWhenUsed="1"/>
-    <w:lsdException w:name="List Bullet" w:semiHidden="1" w:unhideWhenUsed="1"/>
-    <w:lsdException w:name="List Number" w:semiHidden="1" w:unhideWhenUsed="1"/>
-    <w:lsdException w:name="List 2" w:semiHidden="1" w:unhideWhenUsed="1"/>
-    <w:lsdException w:name="List 3" w:semiHidden="1" w:unhideWhenUsed="1"/>
-    <w:lsdException w:name="List 4" w:semiHidden="1" w:unhideWhenUsed="1"/>
-    <w:lsdException w:name="List 5" w:semiHidden="1" w:unhideWhenUsed="1"/>
-    <w:lsdException w:name="List Bullet 2" w:semiHidden="1" w:unhideWhenUsed="1"/>
-    <w:lsdException w:name="List Bullet 3" w:semiHidden="1" w:unhideWhenUsed="1"/>
-    <w:lsdException w:name="List Bullet 4" w:semiHidden="1" w:unhideWhenUsed="1"/>
-    <w:lsdException w:name="List Bullet 5" w:semiHidden="1" w:unhideWhenUsed="1"/>
-    <w:lsdException w:name="List Number 2" w:semiHidden="1" w:unhideWhenUsed="1"/>
-    <w:lsdException w:name="List Number 3" w:semiHidden="1" w:unhideWhenUsed="1"/>
-    <w:lsdException w:name="List Number 4" w:semiHidden="1" w:unhideWhenUsed="1"/>
-    <w:lsdException w:name="List Number 5" w:semiHidden="1" w:unhideWhenUsed="1"/>
-    <w:lsdException w:name="Title" w:uiPriority="10" w:qFormat="1"/>
-    <w:lsdException w:name="Closing" w:semiHidden="1" w:unhideWhenUsed="1"/>
-    <w:lsdException w:name="Signature" w:semiHidden="1" w:unhideWhenUsed="1"/>
-    <w:lsdException w:name="Default Paragraph Font" w:semiHidden="1" w:uiPriority="1" w:unhideWhenUsed="1"/>
-    <w:lsdException w:name="Body Text" w:semiHidden="1" w:unhideWhenUsed="1"/>
-    <w:lsdException w:name="Body Text Indent" w:semiHidden="1" w:unhideWhenUsed="1"/>
-    <w:lsdException w:name="List Continue" w:semiHidden="1" w:unhideWhenUsed="1"/>
-    <w:lsdException w:name="List Continue 2" w:semiHidden="1" w:unhideWhenUsed="1"/>
-    <w:lsdException w:name="List Continue 3" w:semiHidden="1" w:unhideWhenUsed="1"/>
-    <w:lsdException w:name="List Continue 4" w:semiHidden="1" w:unhideWhenUsed="1"/>
-    <w:lsdException w:name="List Continue 5" w:semiHidden="1" w:unhideWhenUsed="1"/>
-    <w:lsdException w:name="Message Header" w:semiHidden="1" w:unhideWhenUsed="1"/>
-    <w:lsdException w:name="Subtitle" w:uiPriority="11" w:qFormat="1"/>
-    <w:lsdException w:name="Salutation" w:semiHidden="1" w:unhideWhenUsed="1"/>
-    <w:lsdException w:name="Date" w:semiHidden="1" w:unhideWhenUsed="1"/>
-    <w:lsdException w:name="Body Text First Indent" w:semiHidden="1" w:unhideWhenUsed="1"/>
-    <w:lsdException w:name="Body Text First Indent 2" w:semiHidden="1" w:unhideWhenUsed="1"/>
-    <w:lsdException w:name="Note Heading" w:semiHidden="1" w:unhideWhenUsed="1"/>
-    <w:lsdException w:name="Body Text 2" w:semiHidden="1" w:unhideWhenUsed="1"/>
-    <w:lsdException w:name="Body Text 3" w:semiHidden="1" w:unhideWhenUsed="1"/>
-    <w:lsdException w:name="Body Text Indent 2" w:semiHidden="1" w:unhideWhenUsed="1"/>
-    <w:lsdException w:name="Body Text Indent 3" w:semiHidden="1" w:unhideWhenUsed="1"/>
-    <w:lsdException w:name="Block Text" w:semiHidden="1" w:unhideWhenUsed="1"/>
-    <w:lsdException w:name="Hyperlink" w:semiHidden="1" w:unhideWhenUsed="1"/>
-    <w:lsdException w:name="FollowedHyperlink" w:semiHidden="1" w:unhideWhenUsed="1"/>
-    <w:lsdException w:name="Strong" w:uiPriority="22" w:qFormat="1"/>
-    <w:lsdException w:name="Emphasis" w:uiPriority="20" w:qFormat="1"/>
-    <w:lsdException w:name="Document Map" w:semiHidden="1" w:unhideWhenUsed="1"/>
-    <w:lsdException w:name="Plain Text" w:semiHidden="1" w:unhideWhenUsed="1"/>
-    <w:lsdException w:name="E-mail Signature" w:semiHidden="1" w:unhideWhenUsed="1"/>
-    <w:lsdException w:name="HTML Top of Form" w:semiHidden="1" w:unhideWhenUsed="1"/>
-    <w:lsdException w:name="HTML Bottom of Form" w:semiHidden="1" w:unhideWhenUsed="1"/>
-    <w:lsdException w:name="Normal (Web)" w:semiHidden="1" w:unhideWhenUsed="1"/>
-    <w:lsdException w:name="HTML Acronym" w:semiHidden="1" w:unhideWhenUsed="1"/>
-    <w:lsdException w:name="HTML Address" w:semiHidden="1" w:unhideWhenUsed="1"/>
-    <w:lsdException w:name="HTML Cite" w:semiHidden="1" w:unhideWhenUsed="1"/>
-    <w:lsdException w:name="HTML Code" w:semiHidden="1" w:unhideWhenUsed="1"/>
-    <w:lsdException w:name="HTML Definition" w:semiHidden="1" w:unhideWhenUsed="1"/>
-    <w:lsdException w:name="HTML Keyboard" w:semiHidden="1" w:unhideWhenUsed="1"/>
-    <w:lsdException w:name="HTML Preformatted" w:semiHidden="1" w:unhideWhenUsed="1"/>
-    <w:lsdException w:name="HTML Sample" w:semiHidden="1" w:unhideWhenUsed="1"/>
-    <w:lsdException w:name="HTML Typewriter" w:semiHidden="1" w:unhideWhenUsed="1"/>
-    <w:lsdException w:name="HTML Variable" w:semiHidden="1" w:unhideWhenUsed="1"/>
+  <w:latentStyles w:defLockedState="0" w:defUIPriority="0" w:defSemiHidden="0" w:defUnhideWhenUsed="0" w:defQFormat="0" w:count="376">
+    <w:lsdException w:name="heading 1" w:qFormat="1"/>
+    <w:lsdException w:name="heading 4" w:semiHidden="1" w:unhideWhenUsed="1" w:qFormat="1"/>
+    <w:lsdException w:name="heading 5" w:semiHidden="1" w:unhideWhenUsed="1" w:qFormat="1"/>
+    <w:lsdException w:name="heading 6" w:semiHidden="1" w:unhideWhenUsed="1" w:qFormat="1"/>
+    <w:lsdException w:name="heading 7" w:semiHidden="1" w:unhideWhenUsed="1" w:qFormat="1"/>
+    <w:lsdException w:name="heading 8" w:semiHidden="1" w:unhideWhenUsed="1" w:qFormat="1"/>
+    <w:lsdException w:name="heading 9" w:semiHidden="1" w:unhideWhenUsed="1" w:qFormat="1"/>
+    <w:lsdException w:name="index 6" w:qFormat="1"/>
+    <w:lsdException w:name="annotation text" w:qFormat="1"/>
+    <w:lsdException w:name="header" w:qFormat="1"/>
+    <w:lsdException w:name="footer" w:qFormat="1"/>
+    <w:lsdException w:name="table of figures" w:qFormat="1"/>
+    <w:lsdException w:name="envelope return" w:qFormat="1"/>
+    <w:lsdException w:name="annotation reference" w:qFormat="1"/>
+    <w:lsdException w:name="line number" w:qFormat="1"/>
+    <w:lsdException w:name="endnote reference" w:qFormat="1"/>
+    <w:lsdException w:name="table of authorities" w:qFormat="1"/>
+    <w:lsdException w:name="macro" w:qFormat="1"/>
+    <w:lsdException w:name="List Bullet" w:qFormat="1"/>
+    <w:lsdException w:name="List 2" w:qFormat="1"/>
+    <w:lsdException w:name="List 4" w:qFormat="1"/>
+    <w:lsdException w:name="List 5" w:qFormat="1"/>
+    <w:lsdException w:name="List Bullet 2" w:qFormat="1"/>
+    <w:lsdException w:name="List Bullet 4" w:qFormat="1"/>
+    <w:lsdException w:name="List Bullet 5" w:qFormat="1"/>
+    <w:lsdException w:name="List Number 2" w:qFormat="1"/>
+    <w:lsdException w:name="List Number 3" w:qFormat="1"/>
+    <w:lsdException w:name="List Number 4" w:qFormat="1"/>
+    <w:lsdException w:name="List Number 5" w:qFormat="1"/>
+    <w:lsdException w:name="Title" w:qFormat="1"/>
+    <w:lsdException w:name="Closing" w:qFormat="1"/>
+    <w:lsdException w:name="Signature" w:qFormat="1"/>
+    <w:lsdException w:name="Default Paragraph Font" w:semiHidden="1"/>
+    <w:lsdException w:name="Body Text Indent" w:qFormat="1"/>
+    <w:lsdException w:name="List Continue" w:qFormat="1"/>
+    <w:lsdException w:name="List Continue 3" w:qFormat="1"/>
+    <w:lsdException w:name="List Continue 4" w:qFormat="1"/>
+    <w:lsdException w:name="List Continue 5" w:qFormat="1"/>
+    <w:lsdException w:name="Subtitle" w:qFormat="1"/>
+    <w:lsdException w:name="Salutation" w:qFormat="1"/>
+    <w:lsdException w:name="Date" w:qFormat="1"/>
+    <w:lsdException w:name="Note Heading" w:qFormat="1"/>
+    <w:lsdException w:name="Body Text 3" w:qFormat="1"/>
+    <w:lsdException w:name="Body Text Indent 3" w:qFormat="1"/>
+    <w:lsdException w:name="Strong" w:qFormat="1"/>
+    <w:lsdException w:name="Emphasis" w:qFormat="1"/>
+    <w:lsdException w:name="Plain Text" w:qFormat="1"/>
+    <w:lsdException w:name="E-mail Signature" w:qFormat="1"/>
+    <w:lsdException w:name="HTML Top of Form" w:semiHidden="1" w:uiPriority="99" w:unhideWhenUsed="1"/>
+    <w:lsdException w:name="HTML Bottom of Form" w:semiHidden="1" w:uiPriority="99" w:unhideWhenUsed="1"/>
+    <w:lsdException w:name="HTML Address" w:qFormat="1"/>
+    <w:lsdException w:name="HTML Code" w:qFormat="1"/>
+    <w:lsdException w:name="HTML Definition" w:qFormat="1"/>
+    <w:lsdException w:name="HTML Keyboard" w:qFormat="1"/>
     <w:lsdException w:name="Normal Table" w:semiHidden="1" w:unhideWhenUsed="1"/>
-    <w:lsdException w:name="annotation subject" w:semiHidden="1" w:unhideWhenUsed="1"/>
-    <w:lsdException w:name="No List" w:semiHidden="1" w:unhideWhenUsed="1"/>
-    <w:lsdException w:name="Outline List 1" w:semiHidden="1" w:unhideWhenUsed="1"/>
-    <w:lsdException w:name="Outline List 2" w:semiHidden="1" w:unhideWhenUsed="1"/>
-    <w:lsdException w:name="Outline List 3" w:semiHidden="1" w:unhideWhenUsed="1"/>
+    <w:lsdException w:name="annotation subject" w:qFormat="1"/>
+    <w:lsdException w:name="No List" w:semiHidden="1" w:uiPriority="99" w:unhideWhenUsed="1"/>
+    <w:lsdException w:name="Outline List 1" w:semiHidden="1" w:uiPriority="99" w:unhideWhenUsed="1"/>
+    <w:lsdException w:name="Outline List 2" w:semiHidden="1" w:uiPriority="99" w:unhideWhenUsed="1"/>
+    <w:lsdException w:name="Outline List 3" w:semiHidden="1" w:uiPriority="99" w:unhideWhenUsed="1"/>
     <w:lsdException w:name="Table Simple 1" w:semiHidden="1" w:unhideWhenUsed="1"/>
-    <w:lsdException w:name="Table Simple 2" w:semiHidden="1" w:unhideWhenUsed="1"/>
+    <w:lsdException w:name="Table Simple 2" w:semiHidden="1" w:unhideWhenUsed="1" w:qFormat="1"/>
     <w:lsdException w:name="Table Simple 3" w:semiHidden="1" w:unhideWhenUsed="1"/>
-    <w:lsdException w:name="Table Classic 1" w:semiHidden="1" w:unhideWhenUsed="1"/>
+    <w:lsdException w:name="Table Classic 1" w:semiHidden="1" w:unhideWhenUsed="1" w:qFormat="1"/>
     <w:lsdException w:name="Table Classic 2" w:semiHidden="1" w:unhideWhenUsed="1"/>
     <w:lsdException w:name="Table Classic 3" w:semiHidden="1" w:unhideWhenUsed="1"/>
-    <w:lsdException w:name="Table Classic 4" w:semiHidden="1" w:unhideWhenUsed="1"/>
+    <w:lsdException w:name="Table Classic 4" w:semiHidden="1" w:unhideWhenUsed="1" w:qFormat="1"/>
     <w:lsdException w:name="Table Colorful 1" w:semiHidden="1" w:unhideWhenUsed="1"/>
     <w:lsdException w:name="Table Colorful 2" w:semiHidden="1" w:unhideWhenUsed="1"/>
-    <w:lsdException w:name="Table Colorful 3" w:semiHidden="1" w:unhideWhenUsed="1"/>
-    <w:lsdException w:name="Table Columns 1" w:semiHidden="1" w:unhideWhenUsed="1"/>
-    <w:lsdException w:name="Table Columns 2" w:semiHidden="1" w:unhideWhenUsed="1"/>
+    <w:lsdException w:name="Table Colorful 3" w:semiHidden="1" w:unhideWhenUsed="1" w:qFormat="1"/>
+    <w:lsdException w:name="Table Columns 1" w:semiHidden="1" w:unhideWhenUsed="1" w:qFormat="1"/>
+    <w:lsdException w:name="Table Columns 2" w:semiHidden="1" w:unhideWhenUsed="1" w:qFormat="1"/>
     <w:lsdException w:name="Table Columns 3" w:semiHidden="1" w:unhideWhenUsed="1"/>
-    <w:lsdException w:name="Table Columns 4" w:semiHidden="1" w:unhideWhenUsed="1"/>
-    <w:lsdException w:name="Table Columns 5" w:semiHidden="1" w:unhideWhenUsed="1"/>
+    <w:lsdException w:name="Table Columns 4" w:semiHidden="1" w:unhideWhenUsed="1" w:qFormat="1"/>
+    <w:lsdException w:name="Table Columns 5" w:semiHidden="1" w:unhideWhenUsed="1" w:qFormat="1"/>
     <w:lsdException w:name="Table Grid 1" w:semiHidden="1" w:unhideWhenUsed="1"/>
-    <w:lsdException w:name="Table Grid 2" w:semiHidden="1" w:unhideWhenUsed="1"/>
+    <w:lsdException w:name="Table Grid 2" w:semiHidden="1" w:unhideWhenUsed="1" w:qFormat="1"/>
     <w:lsdException w:name="Table Grid 3" w:semiHidden="1" w:unhideWhenUsed="1"/>
-    <w:lsdException w:name="Table Grid 4" w:semiHidden="1" w:unhideWhenUsed="1"/>
-    <w:lsdException w:name="Table Grid 5" w:semiHidden="1" w:unhideWhenUsed="1"/>
-    <w:lsdException w:name="Table Grid 6" w:semiHidden="1" w:unhideWhenUsed="1"/>
-    <w:lsdException w:name="Table Grid 7" w:semiHidden="1" w:unhideWhenUsed="1"/>
+    <w:lsdException w:name="Table Grid 4" w:semiHidden="1" w:unhideWhenUsed="1" w:qFormat="1"/>
+    <w:lsdException w:name="Table Grid 5" w:semiHidden="1" w:unhideWhenUsed="1" w:qFormat="1"/>
+    <w:lsdException w:name="Table Grid 6" w:semiHidden="1" w:unhideWhenUsed="1" w:qFormat="1"/>
+    <w:lsdException w:name="Table Grid 7" w:semiHidden="1" w:unhideWhenUsed="1" w:qFormat="1"/>
     <w:lsdException w:name="Table Grid 8" w:semiHidden="1" w:unhideWhenUsed="1"/>
-    <w:lsdException w:name="Table List 1" w:semiHidden="1" w:unhideWhenUsed="1"/>
-    <w:lsdException w:name="Table List 2" w:semiHidden="1" w:unhideWhenUsed="1"/>
+    <w:lsdException w:name="Table List 1" w:semiHidden="1" w:unhideWhenUsed="1" w:qFormat="1"/>
+    <w:lsdException w:name="Table List 2" w:semiHidden="1" w:unhideWhenUsed="1" w:qFormat="1"/>
     <w:lsdException w:name="Table List 3" w:semiHidden="1" w:unhideWhenUsed="1"/>
-    <w:lsdException w:name="Table List 4" w:semiHidden="1" w:unhideWhenUsed="1"/>
-    <w:lsdException w:name="Table List 5" w:semiHidden="1" w:unhideWhenUsed="1"/>
+    <w:lsdException w:name="Table List 4" w:semiHidden="1" w:unhideWhenUsed="1" w:qFormat="1"/>
+    <w:lsdException w:name="Table List 5" w:semiHidden="1" w:unhideWhenUsed="1" w:qFormat="1"/>
     <w:lsdException w:name="Table List 6" w:semiHidden="1" w:unhideWhenUsed="1"/>
-    <w:lsdException w:name="Table List 7" w:semiHidden="1" w:unhideWhenUsed="1"/>
-    <w:lsdException w:name="Table List 8" w:semiHidden="1" w:unhideWhenUsed="1"/>
-    <w:lsdException w:name="Table 3D effects 1" w:semiHidden="1" w:unhideWhenUsed="1"/>
-    <w:lsdException w:name="Table 3D effects 2" w:semiHidden="1" w:unhideWhenUsed="1"/>
-    <w:lsdException w:name="Table 3D effects 3" w:semiHidden="1" w:unhideWhenUsed="1"/>
+    <w:lsdException w:name="Table List 7" w:semiHidden="1" w:unhideWhenUsed="1" w:qFormat="1"/>
+    <w:lsdException w:name="Table List 8" w:semiHidden="1" w:unhideWhenUsed="1" w:qFormat="1"/>
+    <w:lsdException w:name="Table 3D effects 1" w:semiHidden="1" w:unhideWhenUsed="1" w:qFormat="1"/>
+    <w:lsdException w:name="Table 3D effects 2" w:semiHidden="1" w:unhideWhenUsed="1" w:qFormat="1"/>
+    <w:lsdException w:name="Table 3D effects 3" w:semiHidden="1" w:unhideWhenUsed="1" w:qFormat="1"/>
     <w:lsdException w:name="Table Contemporary" w:semiHidden="1" w:unhideWhenUsed="1"/>
-    <w:lsdException w:name="Table Elegant" w:semiHidden="1" w:unhideWhenUsed="1"/>
-    <w:lsdException w:name="Table Professional" w:semiHidden="1" w:unhideWhenUsed="1"/>
-    <w:lsdException w:name="Table Subtle 1" w:semiHidden="1" w:unhideWhenUsed="1"/>
+    <w:lsdException w:name="Table Elegant" w:semiHidden="1" w:unhideWhenUsed="1" w:qFormat="1"/>
+    <w:lsdException w:name="Table Professional" w:semiHidden="1" w:unhideWhenUsed="1" w:qFormat="1"/>
+    <w:lsdException w:name="Table Subtle 1" w:semiHidden="1" w:unhideWhenUsed="1" w:qFormat="1"/>
     <w:lsdException w:name="Table Subtle 2" w:semiHidden="1" w:unhideWhenUsed="1"/>
-    <w:lsdException w:name="Table Web 1" w:semiHidden="1" w:unhideWhenUsed="1"/>
-    <w:lsdException w:name="Table Web 2" w:semiHidden="1" w:unhideWhenUsed="1"/>
-    <w:lsdException w:name="Table Web 3" w:semiHidden="1" w:unhideWhenUsed="1"/>
-    <w:lsdException w:name="Balloon Text" w:semiHidden="1" w:unhideWhenUsed="1"/>
-    <w:lsdException w:name="Table Grid" w:uiPriority="39"/>
-    <w:lsdException w:name="Table Theme" w:semiHidden="1" w:unhideWhenUsed="1"/>
-    <w:lsdException w:name="Placeholder Text" w:semiHidden="1"/>
-    <w:lsdException w:name="No Spacing" w:uiPriority="1" w:qFormat="1"/>
-    <w:lsdException w:name="Light Shading" w:uiPriority="60"/>
-    <w:lsdException w:name="Light List" w:uiPriority="61"/>
+    <w:lsdException w:name="Table Web 1" w:semiHidden="1" w:unhideWhenUsed="1" w:qFormat="1"/>
+    <w:lsdException w:name="Table Web 2" w:semiHidden="1" w:unhideWhenUsed="1" w:qFormat="1"/>
+    <w:lsdException w:name="Table Web 3" w:semiHidden="1" w:unhideWhenUsed="1" w:qFormat="1"/>
+    <w:lsdException w:name="Table Grid" w:qFormat="1"/>
+    <w:lsdException w:name="Table Theme" w:semiHidden="1" w:unhideWhenUsed="1" w:qFormat="1"/>
+    <w:lsdException w:name="Placeholder Text" w:semiHidden="1" w:uiPriority="99" w:unhideWhenUsed="1"/>
+    <w:lsdException w:name="No Spacing" w:semiHidden="1" w:uiPriority="99" w:unhideWhenUsed="1"/>
+    <w:lsdException w:name="Light Shading" w:uiPriority="60" w:qFormat="1"/>
+    <w:lsdException w:name="Light List" w:uiPriority="61" w:qFormat="1"/>
     <w:lsdException w:name="Light Grid" w:uiPriority="62"/>
     <w:lsdException w:name="Medium Shading 1" w:uiPriority="63"/>
     <w:lsdException w:name="Medium Shading 2" w:uiPriority="64"/>
@@ -16562,15 +16489,15 @@
     <w:lsdException w:name="Colorful List" w:uiPriority="72"/>
     <w:lsdException w:name="Colorful Grid" w:uiPriority="73"/>
     <w:lsdException w:name="Light Shading Accent 1" w:uiPriority="60"/>
-    <w:lsdException w:name="Light List Accent 1" w:uiPriority="61"/>
+    <w:lsdException w:name="Light List Accent 1" w:uiPriority="61" w:qFormat="1"/>
     <w:lsdException w:name="Light Grid Accent 1" w:uiPriority="62"/>
     <w:lsdException w:name="Medium Shading 1 Accent 1" w:uiPriority="63"/>
     <w:lsdException w:name="Medium Shading 2 Accent 1" w:uiPriority="64"/>
     <w:lsdException w:name="Medium List 1 Accent 1" w:uiPriority="65"/>
-    <w:lsdException w:name="Revision" w:semiHidden="1"/>
-    <w:lsdException w:name="List Paragraph" w:uiPriority="34" w:qFormat="1"/>
-    <w:lsdException w:name="Quote" w:uiPriority="29" w:qFormat="1"/>
-    <w:lsdException w:name="Intense Quote" w:uiPriority="30" w:qFormat="1"/>
+    <w:lsdException w:name="Revision" w:semiHidden="1" w:uiPriority="99" w:unhideWhenUsed="1"/>
+    <w:lsdException w:name="List Paragraph" w:semiHidden="1" w:uiPriority="99" w:unhideWhenUsed="1"/>
+    <w:lsdException w:name="Quote" w:semiHidden="1" w:uiPriority="99" w:unhideWhenUsed="1"/>
+    <w:lsdException w:name="Intense Quote" w:semiHidden="1" w:uiPriority="99" w:unhideWhenUsed="1"/>
     <w:lsdException w:name="Medium List 2 Accent 1" w:uiPriority="66"/>
     <w:lsdException w:name="Medium Grid 1 Accent 1" w:uiPriority="67"/>
     <w:lsdException w:name="Medium Grid 2 Accent 1" w:uiPriority="68"/>
@@ -16579,8 +16506,8 @@
     <w:lsdException w:name="Colorful Shading Accent 1" w:uiPriority="71"/>
     <w:lsdException w:name="Colorful List Accent 1" w:uiPriority="72"/>
     <w:lsdException w:name="Colorful Grid Accent 1" w:uiPriority="73"/>
-    <w:lsdException w:name="Light Shading Accent 2" w:uiPriority="60"/>
-    <w:lsdException w:name="Light List Accent 2" w:uiPriority="61"/>
+    <w:lsdException w:name="Light Shading Accent 2" w:uiPriority="60" w:qFormat="1"/>
+    <w:lsdException w:name="Light List Accent 2" w:uiPriority="61" w:qFormat="1"/>
     <w:lsdException w:name="Light Grid Accent 2" w:uiPriority="62"/>
     <w:lsdException w:name="Medium Shading 1 Accent 2" w:uiPriority="63"/>
     <w:lsdException w:name="Medium Shading 2 Accent 2" w:uiPriority="64"/>
@@ -16593,7 +16520,7 @@
     <w:lsdException w:name="Colorful Shading Accent 2" w:uiPriority="71"/>
     <w:lsdException w:name="Colorful List Accent 2" w:uiPriority="72"/>
     <w:lsdException w:name="Colorful Grid Accent 2" w:uiPriority="73"/>
-    <w:lsdException w:name="Light Shading Accent 3" w:uiPriority="60"/>
+    <w:lsdException w:name="Light Shading Accent 3" w:uiPriority="60" w:qFormat="1"/>
     <w:lsdException w:name="Light List Accent 3" w:uiPriority="61"/>
     <w:lsdException w:name="Light Grid Accent 3" w:uiPriority="62"/>
     <w:lsdException w:name="Medium Shading 1 Accent 3" w:uiPriority="63"/>
@@ -16607,7 +16534,7 @@
     <w:lsdException w:name="Colorful Shading Accent 3" w:uiPriority="71"/>
     <w:lsdException w:name="Colorful List Accent 3" w:uiPriority="72"/>
     <w:lsdException w:name="Colorful Grid Accent 3" w:uiPriority="73"/>
-    <w:lsdException w:name="Light Shading Accent 4" w:uiPriority="60"/>
+    <w:lsdException w:name="Light Shading Accent 4" w:uiPriority="60" w:qFormat="1"/>
     <w:lsdException w:name="Light List Accent 4" w:uiPriority="61"/>
     <w:lsdException w:name="Light Grid Accent 4" w:uiPriority="62"/>
     <w:lsdException w:name="Medium Shading 1 Accent 4" w:uiPriority="63"/>
@@ -16621,7 +16548,7 @@
     <w:lsdException w:name="Colorful Shading Accent 4" w:uiPriority="71"/>
     <w:lsdException w:name="Colorful List Accent 4" w:uiPriority="72"/>
     <w:lsdException w:name="Colorful Grid Accent 4" w:uiPriority="73"/>
-    <w:lsdException w:name="Light Shading Accent 5" w:uiPriority="60"/>
+    <w:lsdException w:name="Light Shading Accent 5" w:uiPriority="60" w:qFormat="1"/>
     <w:lsdException w:name="Light List Accent 5" w:uiPriority="61"/>
     <w:lsdException w:name="Light Grid Accent 5" w:uiPriority="62"/>
     <w:lsdException w:name="Medium Shading 1 Accent 5" w:uiPriority="63"/>
@@ -16760,23 +16687,19 @@
     <w:lsdException w:name="List Table 5 Dark Accent 6" w:uiPriority="50"/>
     <w:lsdException w:name="List Table 6 Colorful Accent 6" w:uiPriority="51"/>
     <w:lsdException w:name="List Table 7 Colorful Accent 6" w:uiPriority="52"/>
-    <w:lsdException w:name="Mention" w:semiHidden="1" w:unhideWhenUsed="1"/>
-    <w:lsdException w:name="Smart Hyperlink" w:semiHidden="1" w:unhideWhenUsed="1"/>
-    <w:lsdException w:name="Hashtag" w:semiHidden="1" w:unhideWhenUsed="1"/>
-    <w:lsdException w:name="Unresolved Mention" w:semiHidden="1" w:unhideWhenUsed="1"/>
-    <w:lsdException w:name="Smart Link" w:semiHidden="1" w:unhideWhenUsed="1"/>
+    <w:lsdException w:name="Mention" w:semiHidden="1" w:uiPriority="99" w:unhideWhenUsed="1"/>
+    <w:lsdException w:name="Smart Hyperlink" w:semiHidden="1" w:uiPriority="99" w:unhideWhenUsed="1"/>
+    <w:lsdException w:name="Hashtag" w:semiHidden="1" w:uiPriority="99" w:unhideWhenUsed="1"/>
+    <w:lsdException w:name="Unresolved Mention" w:semiHidden="1" w:uiPriority="99" w:unhideWhenUsed="1"/>
+    <w:lsdException w:name="Smart Link" w:semiHidden="1" w:uiPriority="99" w:unhideWhenUsed="1"/>
   </w:latentStyles>
   <w:style w:type="paragraph" w:default="1" w:styleId="Normal">
     <w:name w:val="Normal"/>
-    <w:qFormat/>
   </w:style>
   <w:style w:type="paragraph" w:styleId="Heading2">
     <w:name w:val="heading 2"/>
     <w:basedOn w:val="Normal"/>
     <w:next w:val="Normal"/>
-    <w:uiPriority w:val="9"/>
-    <w:unhideWhenUsed/>
-    <w:qFormat/>
     <w:pPr>
       <w:keepNext/>
       <w:keepLines/>
@@ -16797,9 +16720,6 @@
     <w:name w:val="heading 3"/>
     <w:basedOn w:val="Normal"/>
     <w:next w:val="Normal"/>
-    <w:uiPriority w:val="9"/>
-    <w:unhideWhenUsed/>
-    <w:qFormat/>
     <w:pPr>
       <w:keepNext/>
       <w:keepLines/>
@@ -16840,6 +16760,51 @@
     <w:uiPriority w:val="99"/>
     <w:semiHidden/>
     <w:unhideWhenUsed/>
+  </w:style>
+  <w:style w:type="paragraph" w:styleId="BalloonText">
+    <w:name w:val="Balloon Text"/>
+    <w:basedOn w:val="Normal"/>
+    <w:rPr>
+      <w:rFonts w:ascii="Tahoma" w:eastAsia="Tahoma" w:hAnsi="Tahoma"/>
+      <w:sz w:val="16"/>
+    </w:rPr>
+  </w:style>
+  <w:style w:type="paragraph" w:styleId="Caption">
+    <w:name w:val="caption"/>
+    <w:basedOn w:val="Normal"/>
+    <w:next w:val="Normal"/>
+    <w:rPr>
+      <w:b/>
+      <w:color w:val="0F6FC6"/>
+      <w:sz w:val="18"/>
+    </w:rPr>
+  </w:style>
+  <w:style w:type="paragraph" w:styleId="HTMLPreformatted">
+    <w:name w:val="HTML Preformatted"/>
+    <w:basedOn w:val="Normal"/>
+    <w:pPr>
+      <w:tabs>
+        <w:tab w:val="left" w:pos="916"/>
+        <w:tab w:val="left" w:pos="1832"/>
+        <w:tab w:val="left" w:pos="2748"/>
+        <w:tab w:val="left" w:pos="3664"/>
+        <w:tab w:val="left" w:pos="4580"/>
+        <w:tab w:val="left" w:pos="5496"/>
+        <w:tab w:val="left" w:pos="6412"/>
+        <w:tab w:val="left" w:pos="7328"/>
+        <w:tab w:val="left" w:pos="8244"/>
+        <w:tab w:val="left" w:pos="9160"/>
+        <w:tab w:val="left" w:pos="10076"/>
+        <w:tab w:val="left" w:pos="10992"/>
+        <w:tab w:val="left" w:pos="11908"/>
+        <w:tab w:val="left" w:pos="12824"/>
+        <w:tab w:val="left" w:pos="13740"/>
+        <w:tab w:val="left" w:pos="14656"/>
+      </w:tabs>
+    </w:pPr>
+    <w:rPr>
+      <w:rFonts w:ascii="Courier New" w:eastAsia="Courier New" w:hAnsi="Courier New"/>
+    </w:rPr>
   </w:style>
   <w:style w:type="paragraph" w:styleId="NormalWeb">
     <w:name w:val="Normal (Web)"/>
@@ -16947,56 +16912,11 @@
       <w:ind w:left="1760"/>
     </w:pPr>
   </w:style>
-  <w:style w:type="paragraph" w:styleId="BalloonText">
-    <w:name w:val="Balloon Text"/>
-    <w:basedOn w:val="Normal"/>
-    <w:rPr>
-      <w:rFonts w:ascii="Tahoma" w:eastAsia="Tahoma" w:hAnsi="Tahoma"/>
-      <w:sz w:val="16"/>
-    </w:rPr>
-  </w:style>
-  <w:style w:type="paragraph" w:styleId="Caption">
-    <w:name w:val="caption"/>
-    <w:basedOn w:val="Normal"/>
-    <w:next w:val="Normal"/>
-    <w:rPr>
-      <w:b/>
-      <w:color w:val="0F6FC6"/>
-      <w:sz w:val="18"/>
-    </w:rPr>
-  </w:style>
-  <w:style w:type="paragraph" w:styleId="HTMLPreformatted">
-    <w:name w:val="HTML Preformatted"/>
-    <w:basedOn w:val="Normal"/>
-    <w:pPr>
-      <w:tabs>
-        <w:tab w:val="left" w:pos="916"/>
-        <w:tab w:val="left" w:pos="1832"/>
-        <w:tab w:val="left" w:pos="2748"/>
-        <w:tab w:val="left" w:pos="3664"/>
-        <w:tab w:val="left" w:pos="4580"/>
-        <w:tab w:val="left" w:pos="5496"/>
-        <w:tab w:val="left" w:pos="6412"/>
-        <w:tab w:val="left" w:pos="7328"/>
-        <w:tab w:val="left" w:pos="8244"/>
-        <w:tab w:val="left" w:pos="9160"/>
-        <w:tab w:val="left" w:pos="10076"/>
-        <w:tab w:val="left" w:pos="10992"/>
-        <w:tab w:val="left" w:pos="11908"/>
-        <w:tab w:val="left" w:pos="12824"/>
-        <w:tab w:val="left" w:pos="13740"/>
-        <w:tab w:val="left" w:pos="14656"/>
-      </w:tabs>
-    </w:pPr>
-    <w:rPr>
-      <w:rFonts w:ascii="Courier New" w:eastAsia="Courier New" w:hAnsi="Courier New"/>
-    </w:rPr>
-  </w:style>
 </w:styles>
 </file>
 
 <file path=word/theme/theme1.xml><?xml version="1.0" encoding="utf-8"?>
-<a:theme xmlns:a="http://schemas.openxmlformats.org/drawingml/2006/main" name="Office Theme">
+<a:theme xmlns:a="http://schemas.openxmlformats.org/drawingml/2006/main" name="Office">
   <a:themeElements>
     <a:clrScheme name="Office">
       <a:dk1>
@@ -17006,44 +16926,44 @@
         <a:sysClr val="window" lastClr="FFFFFF"/>
       </a:lt1>
       <a:dk2>
-        <a:srgbClr val="0E2841"/>
+        <a:srgbClr val="1F497D"/>
       </a:dk2>
       <a:lt2>
-        <a:srgbClr val="E8E8E8"/>
+        <a:srgbClr val="EEECE1"/>
       </a:lt2>
       <a:accent1>
-        <a:srgbClr val="156082"/>
+        <a:srgbClr val="4F81BD"/>
       </a:accent1>
       <a:accent2>
-        <a:srgbClr val="E97132"/>
+        <a:srgbClr val="C0504D"/>
       </a:accent2>
       <a:accent3>
-        <a:srgbClr val="196B24"/>
+        <a:srgbClr val="9BBB59"/>
       </a:accent3>
       <a:accent4>
-        <a:srgbClr val="0F9ED5"/>
+        <a:srgbClr val="8064A2"/>
       </a:accent4>
       <a:accent5>
-        <a:srgbClr val="A02B93"/>
+        <a:srgbClr val="4BACC6"/>
       </a:accent5>
       <a:accent6>
-        <a:srgbClr val="4EA72E"/>
+        <a:srgbClr val="F79646"/>
       </a:accent6>
       <a:hlink>
-        <a:srgbClr val="467886"/>
+        <a:srgbClr val="0000FF"/>
       </a:hlink>
       <a:folHlink>
-        <a:srgbClr val="96607D"/>
+        <a:srgbClr val="800080"/>
       </a:folHlink>
     </a:clrScheme>
     <a:fontScheme name="Office">
       <a:majorFont>
-        <a:latin typeface="Aptos Display" panose="02110004020202020204"/>
+        <a:latin typeface="Cambria"/>
         <a:ea typeface=""/>
         <a:cs typeface=""/>
-        <a:font script="Jpan" typeface="游ゴシック Light"/>
+        <a:font script="Jpan" typeface="ＭＳ ゴシック"/>
         <a:font script="Hang" typeface="맑은 고딕"/>
-        <a:font script="Hans" typeface="等线 Light"/>
+        <a:font script="Hans" typeface="宋体"/>
         <a:font script="Hant" typeface="新細明體"/>
         <a:font script="Arab" typeface="Times New Roman"/>
         <a:font script="Hebr" typeface="Times New Roman"/>
@@ -17071,31 +16991,14 @@
         <a:font script="Viet" typeface="Times New Roman"/>
         <a:font script="Uigh" typeface="Microsoft Uighur"/>
         <a:font script="Geor" typeface="Sylfaen"/>
-        <a:font script="Armn" typeface="Arial"/>
-        <a:font script="Bugi" typeface="Leelawadee UI"/>
-        <a:font script="Bopo" typeface="Microsoft JhengHei"/>
-        <a:font script="Java" typeface="Javanese Text"/>
-        <a:font script="Lisu" typeface="Segoe UI"/>
-        <a:font script="Mymr" typeface="Myanmar Text"/>
-        <a:font script="Nkoo" typeface="Ebrima"/>
-        <a:font script="Olck" typeface="Nirmala UI"/>
-        <a:font script="Osma" typeface="Ebrima"/>
-        <a:font script="Phag" typeface="Phagspa"/>
-        <a:font script="Syrn" typeface="Estrangelo Edessa"/>
-        <a:font script="Syrj" typeface="Estrangelo Edessa"/>
-        <a:font script="Syre" typeface="Estrangelo Edessa"/>
-        <a:font script="Sora" typeface="Nirmala UI"/>
-        <a:font script="Tale" typeface="Microsoft Tai Le"/>
-        <a:font script="Talu" typeface="Microsoft New Tai Lue"/>
-        <a:font script="Tfng" typeface="Ebrima"/>
       </a:majorFont>
       <a:minorFont>
-        <a:latin typeface="Aptos" panose="02110004020202020204"/>
+        <a:latin typeface="Calibri"/>
         <a:ea typeface=""/>
         <a:cs typeface=""/>
-        <a:font script="Jpan" typeface="游明朝"/>
+        <a:font script="Jpan" typeface="ＭＳ 明朝"/>
         <a:font script="Hang" typeface="맑은 고딕"/>
-        <a:font script="Hans" typeface="等线"/>
+        <a:font script="Hans" typeface="宋体"/>
         <a:font script="Hant" typeface="新細明體"/>
         <a:font script="Arab" typeface="Arial"/>
         <a:font script="Hebr" typeface="Arial"/>
@@ -17123,23 +17026,6 @@
         <a:font script="Viet" typeface="Arial"/>
         <a:font script="Uigh" typeface="Microsoft Uighur"/>
         <a:font script="Geor" typeface="Sylfaen"/>
-        <a:font script="Armn" typeface="Arial"/>
-        <a:font script="Bugi" typeface="Leelawadee UI"/>
-        <a:font script="Bopo" typeface="Microsoft JhengHei"/>
-        <a:font script="Java" typeface="Javanese Text"/>
-        <a:font script="Lisu" typeface="Segoe UI"/>
-        <a:font script="Mymr" typeface="Myanmar Text"/>
-        <a:font script="Nkoo" typeface="Ebrima"/>
-        <a:font script="Olck" typeface="Nirmala UI"/>
-        <a:font script="Osma" typeface="Ebrima"/>
-        <a:font script="Phag" typeface="Phagspa"/>
-        <a:font script="Syrn" typeface="Estrangelo Edessa"/>
-        <a:font script="Syrj" typeface="Estrangelo Edessa"/>
-        <a:font script="Syre" typeface="Estrangelo Edessa"/>
-        <a:font script="Sora" typeface="Nirmala UI"/>
-        <a:font script="Tale" typeface="Microsoft Tai Le"/>
-        <a:font script="Talu" typeface="Microsoft New Tai Lue"/>
-        <a:font script="Tfng" typeface="Ebrima"/>
       </a:minorFont>
     </a:fontScheme>
     <a:fmtScheme name="Office">
@@ -17151,161 +17037,165 @@
           <a:gsLst>
             <a:gs pos="0">
               <a:schemeClr val="phClr">
-                <a:lumMod val="110000"/>
-                <a:satMod val="105000"/>
-                <a:tint val="67000"/>
+                <a:tint val="50000"/>
+                <a:satMod val="300000"/>
               </a:schemeClr>
             </a:gs>
-            <a:gs pos="50000">
+            <a:gs pos="35000">
               <a:schemeClr val="phClr">
-                <a:lumMod val="105000"/>
-                <a:satMod val="103000"/>
-                <a:tint val="73000"/>
+                <a:tint val="37000"/>
+                <a:satMod val="300000"/>
               </a:schemeClr>
             </a:gs>
             <a:gs pos="100000">
               <a:schemeClr val="phClr">
-                <a:lumMod val="105000"/>
-                <a:satMod val="109000"/>
-                <a:tint val="81000"/>
+                <a:tint val="15000"/>
+                <a:satMod val="350000"/>
               </a:schemeClr>
             </a:gs>
           </a:gsLst>
-          <a:lin ang="5400000" scaled="0"/>
+          <a:lin ang="16200000" scaled="1"/>
         </a:gradFill>
         <a:gradFill rotWithShape="1">
           <a:gsLst>
             <a:gs pos="0">
               <a:schemeClr val="phClr">
-                <a:satMod val="103000"/>
-                <a:lumMod val="102000"/>
-                <a:tint val="94000"/>
+                <a:shade val="51000"/>
+                <a:satMod val="130000"/>
               </a:schemeClr>
             </a:gs>
-            <a:gs pos="50000">
+            <a:gs pos="80000">
               <a:schemeClr val="phClr">
-                <a:satMod val="110000"/>
-                <a:lumMod val="100000"/>
-                <a:shade val="100000"/>
+                <a:shade val="93000"/>
+                <a:satMod val="130000"/>
               </a:schemeClr>
             </a:gs>
             <a:gs pos="100000">
               <a:schemeClr val="phClr">
-                <a:lumMod val="99000"/>
-                <a:satMod val="120000"/>
-                <a:shade val="78000"/>
+                <a:shade val="94000"/>
+                <a:satMod val="135000"/>
               </a:schemeClr>
             </a:gs>
           </a:gsLst>
-          <a:lin ang="5400000" scaled="0"/>
+          <a:lin ang="16200000" scaled="0"/>
         </a:gradFill>
       </a:fillStyleLst>
       <a:lnStyleLst>
-        <a:ln w="12700" cap="flat" cmpd="sng" algn="ctr">
+        <a:ln w="9525" cap="flat" cmpd="sng" algn="ctr">
           <a:solidFill>
-            <a:schemeClr val="phClr"/>
+            <a:schemeClr val="phClr">
+              <a:shade val="95000"/>
+              <a:satMod val="105000"/>
+            </a:schemeClr>
           </a:solidFill>
           <a:prstDash val="solid"/>
-          <a:miter lim="800000"/>
-        </a:ln>
-        <a:ln w="19050" cap="flat" cmpd="sng" algn="ctr">
-          <a:solidFill>
-            <a:schemeClr val="phClr"/>
-          </a:solidFill>
-          <a:prstDash val="solid"/>
-          <a:miter lim="800000"/>
         </a:ln>
         <a:ln w="25400" cap="flat" cmpd="sng" algn="ctr">
           <a:solidFill>
             <a:schemeClr val="phClr"/>
           </a:solidFill>
           <a:prstDash val="solid"/>
-          <a:miter lim="800000"/>
+        </a:ln>
+        <a:ln w="38100" cap="flat" cmpd="sng" algn="ctr">
+          <a:solidFill>
+            <a:schemeClr val="phClr"/>
+          </a:solidFill>
+          <a:prstDash val="solid"/>
         </a:ln>
       </a:lnStyleLst>
       <a:effectStyleLst>
         <a:effectStyle>
-          <a:effectLst/>
-        </a:effectStyle>
-        <a:effectStyle>
-          <a:effectLst/>
+          <a:effectLst>
+            <a:outerShdw blurRad="40000" dist="20000" dir="5400000" rotWithShape="0">
+              <a:srgbClr val="000000">
+                <a:alpha val="38000"/>
+              </a:srgbClr>
+            </a:outerShdw>
+          </a:effectLst>
         </a:effectStyle>
         <a:effectStyle>
           <a:effectLst>
-            <a:outerShdw blurRad="57150" dist="19050" dir="5400000" algn="ctr" rotWithShape="0">
+            <a:outerShdw blurRad="40000" dist="23000" dir="5400000" rotWithShape="0">
               <a:srgbClr val="000000">
-                <a:alpha val="63000"/>
+                <a:alpha val="35000"/>
               </a:srgbClr>
             </a:outerShdw>
           </a:effectLst>
+        </a:effectStyle>
+        <a:effectStyle>
+          <a:effectLst>
+            <a:outerShdw blurRad="40000" dist="23000" dir="5400000" rotWithShape="0">
+              <a:srgbClr val="000000">
+                <a:alpha val="35000"/>
+              </a:srgbClr>
+            </a:outerShdw>
+          </a:effectLst>
+          <a:scene3d>
+            <a:camera prst="orthographicFront">
+              <a:rot lat="0" lon="0" rev="0"/>
+            </a:camera>
+            <a:lightRig rig="threePt" dir="t">
+              <a:rot lat="0" lon="0" rev="1200000"/>
+            </a:lightRig>
+          </a:scene3d>
+          <a:sp3d>
+            <a:bevelT w="63500" h="25400"/>
+          </a:sp3d>
         </a:effectStyle>
       </a:effectStyleLst>
       <a:bgFillStyleLst>
         <a:solidFill>
           <a:schemeClr val="phClr"/>
         </a:solidFill>
-        <a:solidFill>
-          <a:schemeClr val="phClr">
-            <a:tint val="95000"/>
-            <a:satMod val="170000"/>
-          </a:schemeClr>
-        </a:solidFill>
         <a:gradFill rotWithShape="1">
           <a:gsLst>
             <a:gs pos="0">
               <a:schemeClr val="phClr">
-                <a:tint val="93000"/>
-                <a:satMod val="150000"/>
-                <a:shade val="98000"/>
-                <a:lumMod val="102000"/>
+                <a:tint val="40000"/>
+                <a:satMod val="350000"/>
               </a:schemeClr>
             </a:gs>
-            <a:gs pos="50000">
+            <a:gs pos="40000">
               <a:schemeClr val="phClr">
-                <a:tint val="98000"/>
-                <a:satMod val="130000"/>
-                <a:shade val="90000"/>
-                <a:lumMod val="103000"/>
+                <a:tint val="45000"/>
+                <a:satMod val="350000"/>
+                <a:shade val="99000"/>
               </a:schemeClr>
             </a:gs>
             <a:gs pos="100000">
               <a:schemeClr val="phClr">
-                <a:shade val="63000"/>
-                <a:satMod val="120000"/>
+                <a:shade val="20000"/>
+                <a:satMod val="255000"/>
               </a:schemeClr>
             </a:gs>
           </a:gsLst>
-          <a:lin ang="5400000" scaled="0"/>
+          <a:path path="circle">
+            <a:fillToRect l="50000" t="-80000" r="50000" b="180000"/>
+          </a:path>
+        </a:gradFill>
+        <a:gradFill rotWithShape="1">
+          <a:gsLst>
+            <a:gs pos="0">
+              <a:schemeClr val="phClr">
+                <a:tint val="80000"/>
+                <a:satMod val="300000"/>
+              </a:schemeClr>
+            </a:gs>
+            <a:gs pos="100000">
+              <a:schemeClr val="phClr">
+                <a:shade val="30000"/>
+                <a:satMod val="200000"/>
+              </a:schemeClr>
+            </a:gs>
+          </a:gsLst>
+          <a:path path="circle">
+            <a:fillToRect l="50000" t="50000" r="50000" b="50000"/>
+          </a:path>
         </a:gradFill>
       </a:bgFillStyleLst>
     </a:fmtScheme>
   </a:themeElements>
-  <a:objectDefaults>
-    <a:lnDef>
-      <a:spPr/>
-      <a:bodyPr/>
-      <a:lstStyle/>
-      <a:style>
-        <a:lnRef idx="2">
-          <a:schemeClr val="accent1"/>
-        </a:lnRef>
-        <a:fillRef idx="0">
-          <a:schemeClr val="accent1"/>
-        </a:fillRef>
-        <a:effectRef idx="1">
-          <a:schemeClr val="accent1"/>
-        </a:effectRef>
-        <a:fontRef idx="minor">
-          <a:schemeClr val="tx1"/>
-        </a:fontRef>
-      </a:style>
-    </a:lnDef>
-  </a:objectDefaults>
+  <a:objectDefaults/>
   <a:extraClrSchemeLst/>
-  <a:extLst>
-    <a:ext uri="{05A4C25C-085E-4340-85A3-A5531E510DB2}">
-      <thm15:themeFamily xmlns:thm15="http://schemas.microsoft.com/office/thememl/2012/main" name="Office Theme" id="{2E142A2C-CD16-42D6-873A-C26D2A0506FA}" vid="{1BDDFF52-6CD6-40A5-AB3C-68EB2F1E4D0A}"/>
-    </a:ext>
-  </a:extLst>
 </a:theme>
 </file>
</xml_diff>